<commit_message>
feat(laporan): implement docxcompose for manual landscape report merge, fix word lag with max 150 char truncation, and add author_display config
</commit_message>
<xml_diff>
--- a/script-laporan-bulanan/input/202607/weekly_report.docx
+++ b/script-laporan-bulanan/input/202607/weekly_report.docx
@@ -1782,6 +1782,182 @@
                 <w:sz w:val="18"/>
               </w:rPr>
               <w:t>https://github.com/systemcerdas/sipservice/pull/28 https://github.com/systemcerdas/sipservice/pull/29 https://github.com/systemcerdas/sipservice/pull/30 https://github.com/systemcerdas/sipservice/pull/31</w:t>
+            </w:r>
+          </w:p>
+        </w:tc>
+      </w:tr>
+      <w:tr>
+        <w:trPr>
+          <w:cantSplit w:val="0"/>
+          <w:tblHeader w:val="0"/>
+        </w:trPr>
+        <w:tc>
+          <w:tcPr/>
+          <w:p>
+            <w:r>
+              <w:rPr>
+                <w:rFonts w:ascii="Calibri" w:hAnsi="Calibri"/>
+                <w:sz w:val="18"/>
+              </w:rPr>
+            </w:r>
+          </w:p>
+        </w:tc>
+        <w:tc>
+          <w:tcPr/>
+          <w:p>
+            <w:r>
+              <w:rPr>
+                <w:rFonts w:ascii="Calibri" w:hAnsi="Calibri"/>
+                <w:sz w:val="18"/>
+              </w:rPr>
+            </w:r>
+          </w:p>
+        </w:tc>
+        <w:tc>
+          <w:tcPr/>
+          <w:p>
+            <w:r>
+              <w:rPr>
+                <w:rFonts w:ascii="Calibri" w:hAnsi="Calibri"/>
+                <w:sz w:val="18"/>
+              </w:rPr>
+              <w:t>29</w:t>
+            </w:r>
+          </w:p>
+        </w:tc>
+        <w:tc>
+          <w:tcPr/>
+          <w:p>
+            <w:r>
+              <w:rPr>
+                <w:rFonts w:ascii="Calibri" w:hAnsi="Calibri"/>
+                <w:sz w:val="18"/>
+              </w:rPr>
+              <w:t>Perbaikan Filter Tanggal Korespondensi</w:t>
+            </w:r>
+          </w:p>
+        </w:tc>
+        <w:tc>
+          <w:tcPr/>
+          <w:p>
+            <w:r>
+              <w:rPr>
+                <w:rFonts w:ascii="Calibri" w:hAnsi="Calibri"/>
+                <w:sz w:val="18"/>
+              </w:rPr>
+              <w:t>Memperbaiki filter tanggal mulai dan akhir pada modul korespondensi</w:t>
+            </w:r>
+          </w:p>
+        </w:tc>
+        <w:tc>
+          <w:tcPr/>
+          <w:p>
+            <w:r>
+              <w:rPr>
+                <w:rFonts w:ascii="Calibri" w:hAnsi="Calibri"/>
+                <w:sz w:val="18"/>
+              </w:rPr>
+              <w:t>Lutfi</w:t>
+            </w:r>
+          </w:p>
+        </w:tc>
+        <w:tc>
+          <w:tcPr/>
+          <w:p>
+            <w:r>
+              <w:rPr>
+                <w:rFonts w:ascii="Calibri" w:hAnsi="Calibri"/>
+                <w:sz w:val="18"/>
+              </w:rPr>
+              <w:t>https://github.com/systemcerdas/sipservice/pull/32</w:t>
+            </w:r>
+          </w:p>
+        </w:tc>
+      </w:tr>
+      <w:tr>
+        <w:trPr>
+          <w:cantSplit w:val="0"/>
+          <w:tblHeader w:val="0"/>
+        </w:trPr>
+        <w:tc>
+          <w:tcPr/>
+          <w:p>
+            <w:r>
+              <w:rPr>
+                <w:rFonts w:ascii="Calibri" w:hAnsi="Calibri"/>
+                <w:sz w:val="18"/>
+              </w:rPr>
+            </w:r>
+          </w:p>
+        </w:tc>
+        <w:tc>
+          <w:tcPr/>
+          <w:p>
+            <w:r>
+              <w:rPr>
+                <w:rFonts w:ascii="Calibri" w:hAnsi="Calibri"/>
+                <w:sz w:val="18"/>
+              </w:rPr>
+            </w:r>
+          </w:p>
+        </w:tc>
+        <w:tc>
+          <w:tcPr/>
+          <w:p>
+            <w:r>
+              <w:rPr>
+                <w:rFonts w:ascii="Calibri" w:hAnsi="Calibri"/>
+                <w:sz w:val="18"/>
+              </w:rPr>
+              <w:t>30</w:t>
+            </w:r>
+          </w:p>
+        </w:tc>
+        <w:tc>
+          <w:tcPr/>
+          <w:p>
+            <w:r>
+              <w:rPr>
+                <w:rFonts w:ascii="Calibri" w:hAnsi="Calibri"/>
+                <w:sz w:val="18"/>
+              </w:rPr>
+              <w:t>Perbaikan Modul PSDKP Angka (Tampilan dan Armada)</w:t>
+            </w:r>
+          </w:p>
+        </w:tc>
+        <w:tc>
+          <w:tcPr/>
+          <w:p>
+            <w:r>
+              <w:rPr>
+                <w:rFonts w:ascii="Calibri" w:hAnsi="Calibri"/>
+                <w:sz w:val="18"/>
+              </w:rPr>
+              <w:t>Perbaikan warna legenda, penyesuaian armada pesawat, penyembunyian wilker, dan penghapusan duplikat kapal</w:t>
+            </w:r>
+          </w:p>
+        </w:tc>
+        <w:tc>
+          <w:tcPr/>
+          <w:p>
+            <w:r>
+              <w:rPr>
+                <w:rFonts w:ascii="Calibri" w:hAnsi="Calibri"/>
+                <w:sz w:val="18"/>
+              </w:rPr>
+              <w:t>Lutfi</w:t>
+            </w:r>
+          </w:p>
+        </w:tc>
+        <w:tc>
+          <w:tcPr/>
+          <w:p>
+            <w:r>
+              <w:rPr>
+                <w:rFonts w:ascii="Calibri" w:hAnsi="Calibri"/>
+                <w:sz w:val="18"/>
+              </w:rPr>
+              <w:t>https://github.com/systemcerdas/sipservice/pull/33 https://github.com/systemcerdas/sipservice/pull/34 https://github.com/systemcerdas/sipservice/pull/35 https://github.com/systemcerdas/sipservice/pull/36 https://github.com/systemcerdas/sipservice/pull/37</w:t>
             </w:r>
           </w:p>
         </w:tc>

</xml_diff>